<commit_message>
24/9 FA Workspace fix + Dashboard improvement
</commit_message>
<xml_diff>
--- a/docs/user-guides/manuals/user-manual-redteam-manager.th.docx
+++ b/docs/user-guides/manuals/user-manual-redteam-manager.th.docx
@@ -1014,7 +1014,74 @@
           <w:sz w:val="32"/>
           <w:szCs w:val="32"/>
         </w:rPr>
-        <w:t xml:space="preserve"> (หัวข้อหน้าจอ: งานตอบสนอง) ซึ่งแสดงเฉพาะคำขอที่มอบหมายให้คุณ พร้อมตัวกรองตามสถานะ</w:t>
+        <w:t xml:space="preserve"> (หัวข้อหน้าจอ: งานตอบสนอง) ซึ่งแสดงเฉพาะคำขอที่มอบหมายให้คุณ พร้อมตัวกรองตามสถานะ แต่ละแถวมีปุ่ม </w:t>
+      </w:r>
+      <w:r>
+        <w:rPr>
+          <w:b/>
+          <w:bCs/>
+          <w:color w:val="1F2D3D"/>
+          <w:sz w:val="32"/>
+          <w:szCs w:val="32"/>
+        </w:rPr>
+        <w:t xml:space="preserve">เปิดคำขอ</w:t>
+      </w:r>
+      <w:r>
+        <w:rPr>
+          <w:sz w:val="32"/>
+          <w:szCs w:val="32"/>
+        </w:rPr>
+        <w:t xml:space="preserve"> ซึ่งพาไปที่การ์ด </w:t>
+      </w:r>
+      <w:r>
+        <w:rPr>
+          <w:b/>
+          <w:bCs/>
+          <w:sz w:val="32"/>
+          <w:szCs w:val="32"/>
+        </w:rPr>
+        <w:t xml:space="preserve">งานของคุณ</w:t>
+      </w:r>
+      <w:r>
+        <w:rPr>
+          <w:sz w:val="32"/>
+          <w:szCs w:val="32"/>
+        </w:rPr>
+        <w:t xml:space="preserve"> บนหน้าตั๋วโดยตรง และปุ่ม </w:t>
+      </w:r>
+      <w:r>
+        <w:rPr>
+          <w:b/>
+          <w:bCs/>
+          <w:color w:val="1F2D3D"/>
+          <w:sz w:val="32"/>
+          <w:szCs w:val="32"/>
+        </w:rPr>
+        <w:t xml:space="preserve">รับงาน</w:t>
+      </w:r>
+      <w:r>
+        <w:rPr>
+          <w:sz w:val="32"/>
+          <w:szCs w:val="32"/>
+        </w:rPr>
+        <w:t xml:space="preserve"> (เมื่อคำขอยังเปิดอยู่) ส่วนคอลัมน์ </w:t>
+      </w:r>
+      <w:r>
+        <w:rPr>
+          <w:b/>
+          <w:bCs/>
+          <w:color w:val="1F2D3D"/>
+          <w:sz w:val="32"/>
+          <w:szCs w:val="32"/>
+        </w:rPr>
+        <w:t xml:space="preserve">เลขที่รายงาน</w:t>
+      </w:r>
+      <w:r>
+        <w:rPr>
+          <w:sz w:val="32"/>
+          <w:szCs w:val="32"/>
+        </w:rPr>
+        <w:t xml:space="preserve"> แสดงเลขรายงานที่บันทึกไว้แล้ว</w:t>
       </w:r>
     </w:p>
     <w:tbl>
@@ -1180,7 +1247,7 @@
           <w:sz w:val="32"/>
           <w:szCs w:val="32"/>
         </w:rPr>
-        <w:t xml:space="preserve">แต่ละคำขอผูกกับตั๋วต้นเรื่อง การดำเนินงานทั้งหมดทำในหน้ารายละเอียดตั๋ว หัวข้อ </w:t>
+        <w:t xml:space="preserve">แต่ละคำขอผูกกับตั๋วต้นเรื่อง และคุณทำงานกับคำขอทั้งหมดจากการ์ด </w:t>
       </w:r>
       <w:r>
         <w:rPr>
@@ -1189,14 +1256,326 @@
           <w:sz w:val="32"/>
           <w:szCs w:val="32"/>
         </w:rPr>
-        <w:t xml:space="preserve">“คำขอทีมตอบสนอง”</w:t>
-      </w:r>
-      <w:r>
-        <w:rPr>
-          <w:sz w:val="32"/>
-          <w:szCs w:val="32"/>
-        </w:rPr>
-        <w:t xml:space="preserve"> (เปลี่ยนชื่อจาก “งานย่อยและคำขอทีมตอบสนอง” ใน v1.7.0)</w:t>
+        <w:t xml:space="preserve">“งานของคุณ”</w:t>
+      </w:r>
+      <w:r>
+        <w:rPr>
+          <w:sz w:val="32"/>
+          <w:szCs w:val="32"/>
+        </w:rPr>
+        <w:t xml:space="preserve"> ซึ่งปักไว้ด้านบนสุดของคอลัมน์การดำเนินการในหน้ารายละเอียดตั๋ว — คอลัมน์ขวาข้างรายละเอียดเคสเมื่อเปิดบนคอมพิวเตอร์ หรือเป็นบล็อกแรกของหน้าเมื่อเปิดบนมือถือ ไม่ต้องเลื่อนหาคำขอของคุณในรายการด้านล่างอีก</w:t>
+      </w:r>
+    </w:p>
+    <w:p>
+      <w:pPr>
+        <w:spacing w:after="120"/>
+      </w:pPr>
+      <w:r>
+        <w:rPr>
+          <w:sz w:val="32"/>
+          <w:szCs w:val="32"/>
+        </w:rPr>
+        <w:t xml:space="preserve">ปุ่ม </w:t>
+      </w:r>
+      <w:r>
+        <w:rPr>
+          <w:b/>
+          <w:bCs/>
+          <w:color w:val="1F2D3D"/>
+          <w:sz w:val="32"/>
+          <w:szCs w:val="32"/>
+        </w:rPr>
+        <w:t xml:space="preserve">เปิดคำขอ</w:t>
+      </w:r>
+      <w:r>
+        <w:rPr>
+          <w:sz w:val="32"/>
+          <w:szCs w:val="32"/>
+        </w:rPr>
+        <w:t xml:space="preserve"> ในหน้างานตอบสนอง และลิงก์ในอีเมลแจ้งคำขอใหม่ จะพามาที่การ์ดนี้โดยตรง การ์ดแสดง:</w:t>
+      </w:r>
+    </w:p>
+    <w:p>
+      <w:pPr>
+        <w:pStyle w:val="ListParagraph"/>
+        <w:numPr>
+          <w:ilvl w:val="0"/>
+          <w:numId w:val="3"/>
+        </w:numPr>
+        <w:spacing w:after="60"/>
+      </w:pPr>
+      <w:r>
+        <w:rPr>
+          <w:b/>
+          <w:bCs/>
+          <w:sz w:val="32"/>
+          <w:szCs w:val="32"/>
+        </w:rPr>
+        <w:t xml:space="preserve">ประเภทคำขอ</w:t>
+      </w:r>
+      <w:r>
+        <w:rPr>
+          <w:sz w:val="32"/>
+          <w:szCs w:val="32"/>
+        </w:rPr>
+        <w:t xml:space="preserve"> และป้ายสถานะ (เปิด / กำลังดำเนินการ / เสร็จสิ้น)</w:t>
+      </w:r>
+    </w:p>
+    <w:p>
+      <w:pPr>
+        <w:pStyle w:val="ListParagraph"/>
+        <w:numPr>
+          <w:ilvl w:val="0"/>
+          <w:numId w:val="3"/>
+        </w:numPr>
+        <w:spacing w:after="60"/>
+      </w:pPr>
+      <w:r>
+        <w:rPr>
+          <w:b/>
+          <w:bCs/>
+          <w:sz w:val="32"/>
+          <w:szCs w:val="32"/>
+        </w:rPr>
+        <w:t xml:space="preserve">ตัวติดตาม 3 ขั้น </w:t>
+      </w:r>
+      <w:r>
+        <w:rPr>
+          <w:b/>
+          <w:bCs/>
+          <w:sz w:val="32"/>
+          <w:szCs w:val="32"/>
+        </w:rPr>
+        <w:t xml:space="preserve">รับงาน → ดำเนินการ → ส่งงาน</w:t>
+      </w:r>
+      <w:r>
+        <w:rPr>
+          <w:sz w:val="32"/>
+          <w:szCs w:val="32"/>
+        </w:rPr>
+        <w:t xml:space="preserve"> — ขั้นที่ทำเสร็จแล้วมีเครื่องหมายถูก ขั้นปัจจุบันเป็นสีเข้ม</w:t>
+      </w:r>
+    </w:p>
+    <w:p>
+      <w:pPr>
+        <w:pStyle w:val="ListParagraph"/>
+        <w:numPr>
+          <w:ilvl w:val="0"/>
+          <w:numId w:val="3"/>
+        </w:numPr>
+        <w:spacing w:after="60"/>
+      </w:pPr>
+      <w:r>
+        <w:rPr>
+          <w:sz w:val="32"/>
+          <w:szCs w:val="32"/>
+        </w:rPr>
+        <w:t xml:space="preserve">ชื่องานและ</w:t>
+      </w:r>
+      <w:r>
+        <w:rPr>
+          <w:b/>
+          <w:bCs/>
+          <w:sz w:val="32"/>
+          <w:szCs w:val="32"/>
+        </w:rPr>
+        <w:t xml:space="preserve">ขอบเขตงาน</w:t>
+      </w:r>
+      <w:r>
+        <w:rPr>
+          <w:sz w:val="32"/>
+          <w:szCs w:val="32"/>
+        </w:rPr>
+        <w:t xml:space="preserve"> ที่ผู้จัดการ SOC เขียนไว้ในคำขอ</w:t>
+      </w:r>
+    </w:p>
+    <w:p>
+      <w:pPr>
+        <w:pStyle w:val="ListParagraph"/>
+        <w:numPr>
+          <w:ilvl w:val="0"/>
+          <w:numId w:val="3"/>
+        </w:numPr>
+        <w:spacing w:after="60"/>
+      </w:pPr>
+      <w:r>
+        <w:rPr>
+          <w:b/>
+          <w:bCs/>
+          <w:color w:val="1F2D3D"/>
+          <w:sz w:val="32"/>
+          <w:szCs w:val="32"/>
+        </w:rPr>
+        <w:t xml:space="preserve">ผู้ร้องขอ</w:t>
+      </w:r>
+      <w:r>
+        <w:rPr>
+          <w:sz w:val="32"/>
+          <w:szCs w:val="32"/>
+        </w:rPr>
+        <w:t xml:space="preserve">, </w:t>
+      </w:r>
+      <w:r>
+        <w:rPr>
+          <w:b/>
+          <w:bCs/>
+          <w:color w:val="1F2D3D"/>
+          <w:sz w:val="32"/>
+          <w:szCs w:val="32"/>
+        </w:rPr>
+        <w:t xml:space="preserve">ส่งคำขอเมื่อ</w:t>
+      </w:r>
+      <w:r>
+        <w:rPr>
+          <w:sz w:val="32"/>
+          <w:szCs w:val="32"/>
+        </w:rPr>
+        <w:t xml:space="preserve"> และ </w:t>
+      </w:r>
+      <w:r>
+        <w:rPr>
+          <w:b/>
+          <w:bCs/>
+          <w:color w:val="1F2D3D"/>
+          <w:sz w:val="32"/>
+          <w:szCs w:val="32"/>
+        </w:rPr>
+        <w:t xml:space="preserve">สถานะตั้งแต่</w:t>
+      </w:r>
+    </w:p>
+    <w:p>
+      <w:pPr>
+        <w:pStyle w:val="ListParagraph"/>
+        <w:numPr>
+          <w:ilvl w:val="0"/>
+          <w:numId w:val="3"/>
+        </w:numPr>
+        <w:spacing w:after="60"/>
+      </w:pPr>
+      <w:r>
+        <w:rPr>
+          <w:sz w:val="32"/>
+          <w:szCs w:val="32"/>
+        </w:rPr>
+        <w:t xml:space="preserve">ส่วนล่างของการ์ดเปลี่ยนตามสถานะ: ปุ่ม </w:t>
+      </w:r>
+      <w:r>
+        <w:rPr>
+          <w:b/>
+          <w:bCs/>
+          <w:color w:val="1F2D3D"/>
+          <w:sz w:val="32"/>
+          <w:szCs w:val="32"/>
+        </w:rPr>
+        <w:t xml:space="preserve">รับงาน</w:t>
+      </w:r>
+      <w:r>
+        <w:rPr>
+          <w:sz w:val="32"/>
+          <w:szCs w:val="32"/>
+        </w:rPr>
+        <w:t xml:space="preserve"> → แบบฟอร์มส่งงาน → สรุป “ส่งงานแล้ว”</w:t>
+      </w:r>
+    </w:p>
+    <w:tbl>
+      <w:tblPr>
+        <w:tblW w:type="dxa" w:w="9600"/>
+        <w:tblBorders>
+          <w:top w:val="dashed" w:color="9DB4D4" w:sz="6"/>
+          <w:left w:val="dashed" w:color="9DB4D4" w:sz="6"/>
+          <w:bottom w:val="dashed" w:color="9DB4D4" w:sz="6"/>
+          <w:right w:val="dashed" w:color="9DB4D4" w:sz="6"/>
+          <w:insideH w:val="single" w:color="auto" w:sz="4"/>
+          <w:insideV w:val="single" w:color="auto" w:sz="4"/>
+        </w:tblBorders>
+      </w:tblPr>
+      <w:tblGrid>
+        <w:gridCol w:w="9600"/>
+      </w:tblGrid>
+      <w:tr>
+        <w:tc>
+          <w:tcPr>
+            <w:tcW w:type="dxa" w:w="9600"/>
+            <w:shd w:fill="F7F8FA" w:color="auto" w:val="clear"/>
+            <w:tcMar>
+              <w:top w:type="dxa" w:w="520"/>
+              <w:left w:type="dxa" w:w="200"/>
+              <w:bottom w:type="dxa" w:w="520"/>
+              <w:right w:type="dxa" w:w="200"/>
+            </w:tcMar>
+            <w:vAlign w:val="center"/>
+          </w:tcPr>
+          <w:p>
+            <w:pPr>
+              <w:spacing w:after="40"/>
+              <w:jc w:val="center"/>
+            </w:pPr>
+            <w:r>
+              <w:rPr>
+                <w:b/>
+                <w:bCs/>
+                <w:color w:val="6C7888"/>
+                <w:sz w:val="30"/>
+                <w:szCs w:val="30"/>
+              </w:rPr>
+              <w:t xml:space="preserve">[ ตำแหน่งภาพหน้าจอ ]</w:t>
+            </w:r>
+          </w:p>
+          <w:p>
+            <w:pPr>
+              <w:spacing w:after="40"/>
+              <w:jc w:val="center"/>
+            </w:pPr>
+            <w:r>
+              <w:rPr>
+                <w:color w:val="1F2D3D"/>
+                <w:sz w:val="32"/>
+                <w:szCs w:val="32"/>
+              </w:rPr>
+              <w:t xml:space="preserve">การ์ด “งานของคุณ” ด้านบนคอลัมน์การดำเนินการ: ตัวติดตาม 3 ขั้น ขอบเขตงาน ผู้ร้องขอ และปุ่มรับงาน</w:t>
+            </w:r>
+          </w:p>
+          <w:p>
+            <w:pPr>
+              <w:jc w:val="center"/>
+            </w:pPr>
+            <w:r>
+              <w:rPr>
+                <w:rFonts w:ascii="Consolas" w:cs="Consolas" w:eastAsia="Consolas" w:hAnsi="Consolas"/>
+                <w:color w:val="9AA6B4"/>
+                <w:sz w:val="24"/>
+                <w:szCs w:val="24"/>
+              </w:rPr>
+              <w:t xml:space="preserve">SHOT: RED-my-request</w:t>
+            </w:r>
+          </w:p>
+        </w:tc>
+      </w:tr>
+    </w:tbl>
+    <w:p>
+      <w:pPr>
+        <w:spacing w:after="160" w:before="60"/>
+        <w:jc w:val="center"/>
+      </w:pPr>
+      <w:r>
+        <w:rPr>
+          <w:b/>
+          <w:bCs/>
+          <w:color w:val="245EA8"/>
+          <w:sz w:val="28"/>
+          <w:szCs w:val="28"/>
+        </w:rPr>
+        <w:t xml:space="preserve">รูปที่ 5-1  </w:t>
+      </w:r>
+      <w:r>
+        <w:rPr>
+          <w:i/>
+          <w:iCs/>
+          <w:color w:val="6C7888"/>
+          <w:sz w:val="28"/>
+          <w:szCs w:val="28"/>
+        </w:rPr>
+        <w:t xml:space="preserve">การ์ด “งานของคุณ” ด้านบนคอลัมน์การดำเนินการ: ตัวติดตาม 3 ขั้น ขอบเขตงาน ผู้ร้องขอ และปุ่มรับงาน</w:t>
       </w:r>
     </w:p>
     <w:tbl>
@@ -1243,67 +1622,295 @@
           </w:p>
           <w:p>
             <w:pPr>
+              <w:spacing w:after="60"/>
+            </w:pPr>
+            <w:r>
+              <w:rPr>
+                <w:sz w:val="32"/>
+                <w:szCs w:val="32"/>
+              </w:rPr>
+              <w:t xml:space="preserve">ในหัวข้อ </w:t>
+            </w:r>
+            <w:r>
+              <w:rPr>
+                <w:b/>
+                <w:bCs/>
+                <w:color w:val="1F2D3D"/>
+                <w:sz w:val="32"/>
+                <w:szCs w:val="32"/>
+              </w:rPr>
+              <w:t xml:space="preserve">คำขอทีมตอบสนอง</w:t>
+            </w:r>
+            <w:r>
+              <w:rPr>
+                <w:sz w:val="32"/>
+                <w:szCs w:val="32"/>
+              </w:rPr>
+              <w:t xml:space="preserve"> ด้านล่างของหน้า แถวคำขอของคุณจะถูกไฮไลต์พร้อมป้าย </w:t>
+            </w:r>
+            <w:r>
+              <w:rPr>
+                <w:b/>
+                <w:bCs/>
+                <w:color w:val="1F2D3D"/>
+                <w:sz w:val="32"/>
+                <w:szCs w:val="32"/>
+              </w:rPr>
+              <w:t xml:space="preserve">งานของคุณ</w:t>
+            </w:r>
+            <w:r>
+              <w:rPr>
+                <w:sz w:val="32"/>
+                <w:szCs w:val="32"/>
+              </w:rPr>
+              <w:t xml:space="preserve"> และมีปุ่ม </w:t>
+            </w:r>
+            <w:r>
+              <w:rPr>
+                <w:b/>
+                <w:bCs/>
+                <w:color w:val="1F2D3D"/>
+                <w:sz w:val="32"/>
+                <w:szCs w:val="32"/>
+              </w:rPr>
+              <w:t xml:space="preserve">ไปที่งานของคุณ</w:t>
+            </w:r>
+            <w:r>
+              <w:rPr>
+                <w:sz w:val="32"/>
+                <w:szCs w:val="32"/>
+              </w:rPr>
+              <w:t xml:space="preserve"> แทนปุ่ม </w:t>
+            </w:r>
+            <w:r>
+              <w:rPr>
+                <w:b/>
+                <w:bCs/>
+                <w:color w:val="1F2D3D"/>
+                <w:sz w:val="32"/>
+                <w:szCs w:val="32"/>
+              </w:rPr>
+              <w:t xml:space="preserve">อัปเดตงาน</w:t>
+            </w:r>
+            <w:r>
+              <w:rPr>
+                <w:sz w:val="32"/>
+                <w:szCs w:val="32"/>
+              </w:rPr>
+              <w:t xml:space="preserve"> เดิม — ไม่มีแบบฟอร์มซ้ำในรายการแล้ว ส่วนลิงก์ </w:t>
+            </w:r>
+            <w:r>
+              <w:rPr>
+                <w:b/>
+                <w:bCs/>
+                <w:color w:val="1F2D3D"/>
+                <w:sz w:val="32"/>
+                <w:szCs w:val="32"/>
+              </w:rPr>
+              <w:t xml:space="preserve">ประวัติสถานะของคำขอ</w:t>
+            </w:r>
+            <w:r>
+              <w:rPr>
+                <w:sz w:val="32"/>
+                <w:szCs w:val="32"/>
+              </w:rPr>
+              <w:t xml:space="preserve"> ท้ายการ์ดจะพาลงไปดูประวัติที่รายการนั้น</w:t>
+            </w:r>
+          </w:p>
+          <w:p>
+            <w:pPr>
               <w:spacing w:after="0"/>
             </w:pPr>
             <w:r>
               <w:rPr>
-                <w:b/>
-                <w:bCs/>
-                <w:sz w:val="32"/>
-                <w:szCs w:val="32"/>
-              </w:rPr>
-              <w:t xml:space="preserve">ปรับปรุง v1.7.0: </w:t>
-            </w:r>
-            <w:r>
-              <w:rPr>
-                <w:sz w:val="32"/>
-                <w:szCs w:val="32"/>
-              </w:rPr>
-              <w:t xml:space="preserve">แบบฟอร์มสร้าง “งานย่อยภายใน SOC” แบบเดิม (การสืบสวน / มาตรการตอบโต้) </w:t>
-            </w:r>
-            <w:r>
-              <w:rPr>
-                <w:b/>
-                <w:bCs/>
-                <w:sz w:val="32"/>
-                <w:szCs w:val="32"/>
-              </w:rPr>
-              <w:t xml:space="preserve">ถูกยกเลิกแล้ว</w:t>
-            </w:r>
-            <w:r>
-              <w:rPr>
-                <w:sz w:val="32"/>
-                <w:szCs w:val="32"/>
-              </w:rPr>
-              <w:t xml:space="preserve"> รายการเก่ายังอ่านย้อนหลังได้ใต้หัวข้อ </w:t>
-            </w:r>
-            <w:r>
-              <w:rPr>
-                <w:b/>
-                <w:bCs/>
-                <w:color w:val="1F2D3D"/>
-                <w:sz w:val="32"/>
-                <w:szCs w:val="32"/>
-              </w:rPr>
-              <w:t xml:space="preserve">บันทึกภายในเดิม (เลิกใช้แล้ว)</w:t>
-            </w:r>
-            <w:r>
-              <w:rPr>
-                <w:sz w:val="32"/>
-                <w:szCs w:val="32"/>
-              </w:rPr>
-              <w:t xml:space="preserve"> ในหน้าเดียวกัน — คำขอทีมตอบสนองคือช่องทางเดียวที่ใช้งานอยู่</w:t>
+                <w:sz w:val="32"/>
+                <w:szCs w:val="32"/>
+              </w:rPr>
+              <w:t xml:space="preserve">หากตั๋วเดียวกันมีคำขอมอบหมายให้คุณมากกว่าหนึ่งรายการ จะมีการ์ดแยกกันรายการละใบ</w:t>
             </w:r>
           </w:p>
         </w:tc>
       </w:tr>
     </w:tbl>
+    <w:p>
+      <w:pPr>
+        <w:spacing w:after="80"/>
+      </w:pPr>
+    </w:p>
+    <w:tbl>
+      <w:tblPr>
+        <w:tblW w:type="dxa" w:w="9600"/>
+        <w:tblBorders>
+          <w:top w:val="single" w:color="F1F3F6" w:sz="2"/>
+          <w:left w:val="single" w:color="6C7888" w:sz="28"/>
+          <w:bottom w:val="single" w:color="F1F3F6" w:sz="2"/>
+          <w:right w:val="single" w:color="F1F3F6" w:sz="2"/>
+          <w:insideH w:val="single" w:color="auto" w:sz="4"/>
+          <w:insideV w:val="single" w:color="auto" w:sz="4"/>
+        </w:tblBorders>
+      </w:tblPr>
+      <w:tblGrid>
+        <w:gridCol w:w="9600"/>
+      </w:tblGrid>
+      <w:tr>
+        <w:tc>
+          <w:tcPr>
+            <w:tcW w:type="dxa" w:w="9600"/>
+            <w:shd w:fill="F1F3F6" w:color="auto" w:val="clear"/>
+            <w:tcMar>
+              <w:top w:type="dxa" w:w="140"/>
+              <w:left w:type="dxa" w:w="200"/>
+              <w:bottom w:type="dxa" w:w="140"/>
+              <w:right w:type="dxa" w:w="200"/>
+            </w:tcMar>
+          </w:tcPr>
+          <w:p>
+            <w:pPr>
+              <w:spacing w:after="60"/>
+            </w:pPr>
+            <w:r>
+              <w:rPr>
+                <w:b/>
+                <w:bCs/>
+                <w:color w:val="6C7888"/>
+                <w:sz w:val="30"/>
+                <w:szCs w:val="30"/>
+              </w:rPr>
+              <w:t xml:space="preserve">สิ่งที่ต้องจำ</w:t>
+            </w:r>
+          </w:p>
+          <w:p>
+            <w:pPr>
+              <w:spacing w:after="0"/>
+            </w:pPr>
+            <w:r>
+              <w:rPr>
+                <w:b/>
+                <w:bCs/>
+                <w:sz w:val="32"/>
+                <w:szCs w:val="32"/>
+              </w:rPr>
+              <w:t xml:space="preserve">ปรับปรุง v1.7.0: </w:t>
+            </w:r>
+            <w:r>
+              <w:rPr>
+                <w:sz w:val="32"/>
+                <w:szCs w:val="32"/>
+              </w:rPr>
+              <w:t xml:space="preserve">แบบฟอร์มสร้าง “งานย่อยภายใน SOC” แบบเดิม (การสืบสวน / มาตรการตอบโต้) </w:t>
+            </w:r>
+            <w:r>
+              <w:rPr>
+                <w:b/>
+                <w:bCs/>
+                <w:sz w:val="32"/>
+                <w:szCs w:val="32"/>
+              </w:rPr>
+              <w:t xml:space="preserve">ถูกยกเลิกแล้ว</w:t>
+            </w:r>
+            <w:r>
+              <w:rPr>
+                <w:sz w:val="32"/>
+                <w:szCs w:val="32"/>
+              </w:rPr>
+              <w:t xml:space="preserve"> รายการเก่ายังอ่านย้อนหลังได้ใต้หัวข้อ </w:t>
+            </w:r>
+            <w:r>
+              <w:rPr>
+                <w:b/>
+                <w:bCs/>
+                <w:color w:val="1F2D3D"/>
+                <w:sz w:val="32"/>
+                <w:szCs w:val="32"/>
+              </w:rPr>
+              <w:t xml:space="preserve">บันทึกภายในเดิม (เลิกใช้แล้ว)</w:t>
+            </w:r>
+            <w:r>
+              <w:rPr>
+                <w:sz w:val="32"/>
+                <w:szCs w:val="32"/>
+              </w:rPr>
+              <w:t xml:space="preserve"> ในหน้าเดียวกัน — คำขอทีมตอบสนองคือช่องทางเดียวที่ใช้งานอยู่</w:t>
+            </w:r>
+          </w:p>
+        </w:tc>
+      </w:tr>
+    </w:tbl>
+    <w:p>
+      <w:pPr>
+        <w:pStyle w:val="Heading2"/>
+      </w:pPr>
+      <w:r>
+        <w:t xml:space="preserve">รับงาน</w:t>
+      </w:r>
+    </w:p>
+    <w:p>
+      <w:pPr>
+        <w:spacing w:after="120"/>
+      </w:pPr>
+      <w:r>
+        <w:rPr>
+          <w:sz w:val="32"/>
+          <w:szCs w:val="32"/>
+        </w:rPr>
+        <w:t xml:space="preserve">เมื่อได้รับคำขอใหม่ (สถานะ </w:t>
+      </w:r>
+      <w:r>
+        <w:rPr>
+          <w:b/>
+          <w:bCs/>
+          <w:sz w:val="32"/>
+          <w:szCs w:val="32"/>
+        </w:rPr>
+        <w:t xml:space="preserve">เปิด</w:t>
+      </w:r>
+      <w:r>
+        <w:rPr>
+          <w:sz w:val="32"/>
+          <w:szCs w:val="32"/>
+        </w:rPr>
+        <w:t xml:space="preserve">) ให้กด </w:t>
+      </w:r>
+      <w:r>
+        <w:rPr>
+          <w:b/>
+          <w:bCs/>
+          <w:color w:val="1F2D3D"/>
+          <w:sz w:val="32"/>
+          <w:szCs w:val="32"/>
+        </w:rPr>
+        <w:t xml:space="preserve">รับงาน</w:t>
+      </w:r>
+      <w:r>
+        <w:rPr>
+          <w:sz w:val="32"/>
+          <w:szCs w:val="32"/>
+        </w:rPr>
+        <w:t xml:space="preserve"> เพื่อบอกผู้จัดการ SOC ว่าคุณเห็นคำขอแล้วและเริ่มลงมือ — คลิกเดียว สถานะเปลี่ยนเป็น </w:t>
+      </w:r>
+      <w:r>
+        <w:rPr>
+          <w:b/>
+          <w:bCs/>
+          <w:sz w:val="32"/>
+          <w:szCs w:val="32"/>
+        </w:rPr>
+        <w:t xml:space="preserve">กำลังดำเนินการ</w:t>
+      </w:r>
+      <w:r>
+        <w:rPr>
+          <w:sz w:val="32"/>
+          <w:szCs w:val="32"/>
+        </w:rPr>
+        <w:t xml:space="preserve"> ทันที ไม่ต้องเลือกสถานะเอง</w:t>
+      </w:r>
+    </w:p>
     <w:p>
       <w:pPr>
         <w:pStyle w:val="ListParagraph"/>
         <w:numPr>
           <w:ilvl w:val="0"/>
-          <w:numId w:val="3"/>
+          <w:numId w:val="4"/>
         </w:numPr>
         <w:spacing w:after="80"/>
       </w:pPr>
@@ -1322,7 +1929,7 @@
           <w:sz w:val="32"/>
           <w:szCs w:val="32"/>
         </w:rPr>
-        <w:t xml:space="preserve">คำขอตอบสนองเหตุการณ์</w:t>
+        <w:t xml:space="preserve">คิวงานต่างๆ › คำขอตอบสนองเหตุการณ์</w:t>
       </w:r>
       <w:r>
         <w:rPr>
@@ -1339,6 +1946,23 @@
           <w:sz w:val="32"/>
           <w:szCs w:val="32"/>
         </w:rPr>
+        <w:t xml:space="preserve">รับงาน</w:t>
+      </w:r>
+      <w:r>
+        <w:rPr>
+          <w:sz w:val="32"/>
+          <w:szCs w:val="32"/>
+        </w:rPr>
+        <w:t xml:space="preserve"> ที่แถวของคำขอได้เลย หรือกด </w:t>
+      </w:r>
+      <w:r>
+        <w:rPr>
+          <w:b/>
+          <w:bCs/>
+          <w:color w:val="1F2D3D"/>
+          <w:sz w:val="32"/>
+          <w:szCs w:val="32"/>
+        </w:rPr>
         <w:t xml:space="preserve">เปิดคำขอ</w:t>
       </w:r>
       <w:r>
@@ -1346,7 +1970,7 @@
           <w:sz w:val="32"/>
           <w:szCs w:val="32"/>
         </w:rPr>
-        <w:t xml:space="preserve"> เพื่อไปยังหน้ารายละเอียดตั๋ว (ส่วนงานย่อย)</w:t>
+        <w:t xml:space="preserve"> ก่อนเพื่ออ่านขอบเขตงานบนการ์ด งานของคุณ</w:t>
       </w:r>
     </w:p>
     <w:p>
@@ -1354,7 +1978,7 @@
         <w:pStyle w:val="ListParagraph"/>
         <w:numPr>
           <w:ilvl w:val="0"/>
-          <w:numId w:val="3"/>
+          <w:numId w:val="4"/>
         </w:numPr>
         <w:spacing w:after="80"/>
       </w:pPr>
@@ -1363,7 +1987,7 @@
           <w:sz w:val="32"/>
           <w:szCs w:val="32"/>
         </w:rPr>
-        <w:t xml:space="preserve">เมื่อเริ่มลงมือ เปลี่ยนสถานะเป็น </w:t>
+        <w:t xml:space="preserve">บนการ์ด </w:t>
       </w:r>
       <w:r>
         <w:rPr>
@@ -1373,7 +1997,31 @@
           <w:sz w:val="32"/>
           <w:szCs w:val="32"/>
         </w:rPr>
-        <w:t xml:space="preserve">กำลังดำเนินการ</w:t>
+        <w:t xml:space="preserve">งานของคุณ</w:t>
+      </w:r>
+      <w:r>
+        <w:rPr>
+          <w:sz w:val="32"/>
+          <w:szCs w:val="32"/>
+        </w:rPr>
+        <w:t xml:space="preserve"> กดปุ่มสีเขียว </w:t>
+      </w:r>
+      <w:r>
+        <w:rPr>
+          <w:b/>
+          <w:bCs/>
+          <w:color w:val="1F2D3D"/>
+          <w:sz w:val="32"/>
+          <w:szCs w:val="32"/>
+        </w:rPr>
+        <w:t xml:space="preserve">รับงาน</w:t>
+      </w:r>
+      <w:r>
+        <w:rPr>
+          <w:sz w:val="32"/>
+          <w:szCs w:val="32"/>
+        </w:rPr>
+        <w:t xml:space="preserve"> (ปุ่มเต็มความกว้างใต้รายละเอียดคำขอ) — ระบบแจ้งว่า “รับงาน … แล้ว — สถานะ: กำลังดำเนินการ”</w:t>
       </w:r>
     </w:p>
     <w:p>
@@ -1381,7 +2029,7 @@
         <w:pStyle w:val="ListParagraph"/>
         <w:numPr>
           <w:ilvl w:val="0"/>
-          <w:numId w:val="3"/>
+          <w:numId w:val="4"/>
         </w:numPr>
         <w:spacing w:after="80"/>
       </w:pPr>
@@ -1390,7 +2038,161 @@
           <w:sz w:val="32"/>
           <w:szCs w:val="32"/>
         </w:rPr>
-        <w:t xml:space="preserve">กรอก </w:t>
+        <w:t xml:space="preserve">ตัวติดตามเลื่อนไปที่ขั้น </w:t>
+      </w:r>
+      <w:r>
+        <w:rPr>
+          <w:b/>
+          <w:bCs/>
+          <w:sz w:val="32"/>
+          <w:szCs w:val="32"/>
+        </w:rPr>
+        <w:t xml:space="preserve">ดำเนินการ</w:t>
+      </w:r>
+      <w:r>
+        <w:rPr>
+          <w:sz w:val="32"/>
+          <w:szCs w:val="32"/>
+        </w:rPr>
+        <w:t xml:space="preserve"> และแบบฟอร์มส่งงานจะเปิดรออยู่บนการ์ดทันที (ดูหัวข้อถัดไป)</w:t>
+      </w:r>
+    </w:p>
+    <w:tbl>
+      <w:tblPr>
+        <w:tblW w:type="dxa" w:w="9600"/>
+        <w:tblBorders>
+          <w:top w:val="single" w:color="F1F3F6" w:sz="2"/>
+          <w:left w:val="single" w:color="6C7888" w:sz="28"/>
+          <w:bottom w:val="single" w:color="F1F3F6" w:sz="2"/>
+          <w:right w:val="single" w:color="F1F3F6" w:sz="2"/>
+          <w:insideH w:val="single" w:color="auto" w:sz="4"/>
+          <w:insideV w:val="single" w:color="auto" w:sz="4"/>
+        </w:tblBorders>
+      </w:tblPr>
+      <w:tblGrid>
+        <w:gridCol w:w="9600"/>
+      </w:tblGrid>
+      <w:tr>
+        <w:tc>
+          <w:tcPr>
+            <w:tcW w:type="dxa" w:w="9600"/>
+            <w:shd w:fill="F1F3F6" w:color="auto" w:val="clear"/>
+            <w:tcMar>
+              <w:top w:type="dxa" w:w="140"/>
+              <w:left w:type="dxa" w:w="200"/>
+              <w:bottom w:type="dxa" w:w="140"/>
+              <w:right w:type="dxa" w:w="200"/>
+            </w:tcMar>
+          </w:tcPr>
+          <w:p>
+            <w:pPr>
+              <w:spacing w:after="60"/>
+            </w:pPr>
+            <w:r>
+              <w:rPr>
+                <w:b/>
+                <w:bCs/>
+                <w:color w:val="6C7888"/>
+                <w:sz w:val="30"/>
+                <w:szCs w:val="30"/>
+              </w:rPr>
+              <w:t xml:space="preserve">สิ่งที่ต้องจำ</w:t>
+            </w:r>
+          </w:p>
+          <w:p>
+            <w:pPr>
+              <w:spacing w:after="60"/>
+            </w:pPr>
+            <w:r>
+              <w:rPr>
+                <w:sz w:val="32"/>
+                <w:szCs w:val="32"/>
+              </w:rPr>
+              <w:t xml:space="preserve">ปุ่ม </w:t>
+            </w:r>
+            <w:r>
+              <w:rPr>
+                <w:b/>
+                <w:bCs/>
+                <w:color w:val="1F2D3D"/>
+                <w:sz w:val="32"/>
+                <w:szCs w:val="32"/>
+              </w:rPr>
+              <w:t xml:space="preserve">รับงาน</w:t>
+            </w:r>
+            <w:r>
+              <w:rPr>
+                <w:sz w:val="32"/>
+                <w:szCs w:val="32"/>
+              </w:rPr>
+              <w:t xml:space="preserve"> แสดงเฉพาะ</w:t>
+            </w:r>
+            <w:r>
+              <w:rPr>
+                <w:b/>
+                <w:bCs/>
+                <w:sz w:val="32"/>
+                <w:szCs w:val="32"/>
+              </w:rPr>
+              <w:t xml:space="preserve">ผู้รับผิดชอบคำขอ</w:t>
+            </w:r>
+            <w:r>
+              <w:rPr>
+                <w:sz w:val="32"/>
+                <w:szCs w:val="32"/>
+              </w:rPr>
+              <w:t xml:space="preserve"> และเฉพาะคำขอที่ยังอยู่ในสถานะ </w:t>
+            </w:r>
+            <w:r>
+              <w:rPr>
+                <w:b/>
+                <w:bCs/>
+                <w:sz w:val="32"/>
+                <w:szCs w:val="32"/>
+              </w:rPr>
+              <w:t xml:space="preserve">เปิด</w:t>
+            </w:r>
+            <w:r>
+              <w:rPr>
+                <w:sz w:val="32"/>
+                <w:szCs w:val="32"/>
+              </w:rPr>
+              <w:t xml:space="preserve"> — กดแล้วปุ่มจะหายไป</w:t>
+            </w:r>
+          </w:p>
+          <w:p>
+            <w:pPr>
+              <w:spacing w:after="0"/>
+            </w:pPr>
+            <w:r>
+              <w:rPr>
+                <w:sz w:val="32"/>
+                <w:szCs w:val="32"/>
+              </w:rPr>
+              <w:t xml:space="preserve">การรับงานถูกบันทึกในประวัติสถานะของคำขอ แต่ไม่ส่งอีเมลแจ้งใคร</w:t>
+            </w:r>
+          </w:p>
+        </w:tc>
+      </w:tr>
+    </w:tbl>
+    <w:p>
+      <w:pPr>
+        <w:pStyle w:val="Heading2"/>
+      </w:pPr>
+      <w:r>
+        <w:t xml:space="preserve">บันทึกผลและส่งงาน</w:t>
+      </w:r>
+    </w:p>
+    <w:p>
+      <w:pPr>
+        <w:spacing w:after="120"/>
+      </w:pPr>
+      <w:r>
+        <w:rPr>
+          <w:sz w:val="32"/>
+          <w:szCs w:val="32"/>
+        </w:rPr>
+        <w:t xml:space="preserve">เมื่อรับงานแล้ว แบบฟอร์มส่งงานจะเปิดอยู่บนการ์ด </w:t>
       </w:r>
       <w:r>
         <w:rPr>
@@ -1400,14 +2202,47 @@
           <w:sz w:val="32"/>
           <w:szCs w:val="32"/>
         </w:rPr>
-        <w:t xml:space="preserve">ผลการดำเนินการ</w:t>
-      </w:r>
-      <w:r>
-        <w:rPr>
-          <w:sz w:val="32"/>
-          <w:szCs w:val="32"/>
-        </w:rPr>
-        <w:t xml:space="preserve"> และ </w:t>
+        <w:t xml:space="preserve">งานของคุณ</w:t>
+      </w:r>
+      <w:r>
+        <w:rPr>
+          <w:sz w:val="32"/>
+          <w:szCs w:val="32"/>
+        </w:rPr>
+        <w:t xml:space="preserve"> ไม่ต้องกดปุ่มใดเพื่อเปิด ทุกคำขอต้องระบุ </w:t>
+      </w:r>
+      <w:r>
+        <w:rPr>
+          <w:b/>
+          <w:bCs/>
+          <w:sz w:val="32"/>
+          <w:szCs w:val="32"/>
+        </w:rPr>
+        <w:t xml:space="preserve">เลขที่รายงาน</w:t>
+      </w:r>
+      <w:r>
+        <w:rPr>
+          <w:sz w:val="32"/>
+          <w:szCs w:val="32"/>
+        </w:rPr>
+        <w:t xml:space="preserve"> ของรายงานที่ส่งก่อนส่งงาน</w:t>
+      </w:r>
+    </w:p>
+    <w:p>
+      <w:pPr>
+        <w:pStyle w:val="ListParagraph"/>
+        <w:numPr>
+          <w:ilvl w:val="0"/>
+          <w:numId w:val="5"/>
+        </w:numPr>
+        <w:spacing w:after="80"/>
+      </w:pPr>
+      <w:r>
+        <w:rPr>
+          <w:sz w:val="32"/>
+          <w:szCs w:val="32"/>
+        </w:rPr>
+        <w:t xml:space="preserve">บนการ์ด </w:t>
       </w:r>
       <w:r>
         <w:rPr>
@@ -1417,14 +2252,61 @@
           <w:sz w:val="32"/>
           <w:szCs w:val="32"/>
         </w:rPr>
-        <w:t xml:space="preserve">แนบไฟล์ผล (ถ้ามี)</w:t>
-      </w:r>
-      <w:r>
-        <w:rPr>
-          <w:sz w:val="32"/>
-          <w:szCs w:val="32"/>
-        </w:rPr>
-        <w:t xml:space="preserve"> แล้วกดบันทึก</w:t>
+        <w:t xml:space="preserve">งานของคุณ</w:t>
+      </w:r>
+      <w:r>
+        <w:rPr>
+          <w:sz w:val="32"/>
+          <w:szCs w:val="32"/>
+        </w:rPr>
+        <w:t xml:space="preserve"> ตรวจช่อง </w:t>
+      </w:r>
+      <w:r>
+        <w:rPr>
+          <w:b/>
+          <w:bCs/>
+          <w:color w:val="1F2D3D"/>
+          <w:sz w:val="32"/>
+          <w:szCs w:val="32"/>
+        </w:rPr>
+        <w:t xml:space="preserve">เลขที่รายงานที่ส่ง</w:t>
+      </w:r>
+      <w:r>
+        <w:rPr>
+          <w:sz w:val="32"/>
+          <w:szCs w:val="32"/>
+        </w:rPr>
+        <w:t xml:space="preserve"> (บังคับ) — ระบบเติมเลขของเคสนี้ให้ในรูปแบบ </w:t>
+      </w:r>
+      <w:r>
+        <w:rPr>
+          <w:rFonts w:ascii="Consolas" w:cs="Consolas" w:eastAsia="Consolas" w:hAnsi="Consolas"/>
+          <w:sz w:val="32"/>
+          <w:szCs w:val="32"/>
+        </w:rPr>
+        <w:t xml:space="preserve">SOC-VAPT-YYYYMM-NNNN</w:t>
+      </w:r>
+      <w:r>
+        <w:rPr>
+          <w:sz w:val="32"/>
+          <w:szCs w:val="32"/>
+        </w:rPr>
+        <w:t xml:space="preserve"> (VA / Pentest) หรือ </w:t>
+      </w:r>
+      <w:r>
+        <w:rPr>
+          <w:rFonts w:ascii="Consolas" w:cs="Consolas" w:eastAsia="Consolas" w:hAnsi="Consolas"/>
+          <w:sz w:val="32"/>
+          <w:szCs w:val="32"/>
+        </w:rPr>
+        <w:t xml:space="preserve">SOC-HARD-YYYYMM-NNNN</w:t>
+      </w:r>
+      <w:r>
+        <w:rPr>
+          <w:sz w:val="32"/>
+          <w:szCs w:val="32"/>
+        </w:rPr>
+        <w:t xml:space="preserve"> (Infrastructure Security) แก้ได้ให้ตรงกับเลขบนรายงานที่ส่งจริง</w:t>
       </w:r>
     </w:p>
     <w:p>
@@ -1432,7 +2314,7 @@
         <w:pStyle w:val="ListParagraph"/>
         <w:numPr>
           <w:ilvl w:val="0"/>
-          <w:numId w:val="3"/>
+          <w:numId w:val="5"/>
         </w:numPr>
         <w:spacing w:after="80"/>
       </w:pPr>
@@ -1441,7 +2323,7 @@
           <w:sz w:val="32"/>
           <w:szCs w:val="32"/>
         </w:rPr>
-        <w:t xml:space="preserve">เมื่อเสร็จ เปลี่ยนสถานะเป็น </w:t>
+        <w:t xml:space="preserve">กรอก </w:t>
       </w:r>
       <w:r>
         <w:rPr>
@@ -1451,6 +2333,123 @@
           <w:sz w:val="32"/>
           <w:szCs w:val="32"/>
         </w:rPr>
+        <w:t xml:space="preserve">ผลการดำเนินการ (ถ้ามี)</w:t>
+      </w:r>
+      <w:r>
+        <w:rPr>
+          <w:sz w:val="32"/>
+          <w:szCs w:val="32"/>
+        </w:rPr>
+        <w:t xml:space="preserve"> และ </w:t>
+      </w:r>
+      <w:r>
+        <w:rPr>
+          <w:b/>
+          <w:bCs/>
+          <w:color w:val="1F2D3D"/>
+          <w:sz w:val="32"/>
+          <w:szCs w:val="32"/>
+        </w:rPr>
+        <w:t xml:space="preserve">แนบไฟล์ผล (ถ้ามี)</w:t>
+      </w:r>
+      <w:r>
+        <w:rPr>
+          <w:sz w:val="32"/>
+          <w:szCs w:val="32"/>
+        </w:rPr>
+        <w:t xml:space="preserve"> พร้อมคำอธิบายไฟล์ในช่องใต้ปุ่มเลือกไฟล์</w:t>
+      </w:r>
+    </w:p>
+    <w:p>
+      <w:pPr>
+        <w:pStyle w:val="ListParagraph"/>
+        <w:numPr>
+          <w:ilvl w:val="0"/>
+          <w:numId w:val="5"/>
+        </w:numPr>
+        <w:spacing w:after="80"/>
+      </w:pPr>
+      <w:r>
+        <w:rPr>
+          <w:sz w:val="32"/>
+          <w:szCs w:val="32"/>
+        </w:rPr>
+        <w:t xml:space="preserve">ระหว่างทางกด </w:t>
+      </w:r>
+      <w:r>
+        <w:rPr>
+          <w:b/>
+          <w:bCs/>
+          <w:color w:val="1F2D3D"/>
+          <w:sz w:val="32"/>
+          <w:szCs w:val="32"/>
+        </w:rPr>
+        <w:t xml:space="preserve">บันทึกไว้ก่อน (ยังไม่ส่งงาน)</w:t>
+      </w:r>
+      <w:r>
+        <w:rPr>
+          <w:sz w:val="32"/>
+          <w:szCs w:val="32"/>
+        </w:rPr>
+        <w:t xml:space="preserve"> เพื่อเก็บผลและไฟล์ไว้ คำขอยังอยู่ที่ </w:t>
+      </w:r>
+      <w:r>
+        <w:rPr>
+          <w:b/>
+          <w:bCs/>
+          <w:sz w:val="32"/>
+          <w:szCs w:val="32"/>
+        </w:rPr>
+        <w:t xml:space="preserve">กำลังดำเนินการ</w:t>
+      </w:r>
+      <w:r>
+        <w:rPr>
+          <w:sz w:val="32"/>
+          <w:szCs w:val="32"/>
+        </w:rPr>
+        <w:t xml:space="preserve"> — ทำซ้ำได้ตามต้องการ</w:t>
+      </w:r>
+    </w:p>
+    <w:p>
+      <w:pPr>
+        <w:pStyle w:val="ListParagraph"/>
+        <w:numPr>
+          <w:ilvl w:val="0"/>
+          <w:numId w:val="5"/>
+        </w:numPr>
+        <w:spacing w:after="80"/>
+      </w:pPr>
+      <w:r>
+        <w:rPr>
+          <w:sz w:val="32"/>
+          <w:szCs w:val="32"/>
+        </w:rPr>
+        <w:t xml:space="preserve">เมื่อเสร็จ กด </w:t>
+      </w:r>
+      <w:r>
+        <w:rPr>
+          <w:b/>
+          <w:bCs/>
+          <w:color w:val="1F2D3D"/>
+          <w:sz w:val="32"/>
+          <w:szCs w:val="32"/>
+        </w:rPr>
+        <w:t xml:space="preserve">ส่งงาน · เสร็จสิ้น</w:t>
+      </w:r>
+      <w:r>
+        <w:rPr>
+          <w:sz w:val="32"/>
+          <w:szCs w:val="32"/>
+        </w:rPr>
+        <w:t xml:space="preserve"> แล้วกดยืนยันในกล่องข้อความ “ยืนยันส่งงาน?” — คำขอปิดเป็น </w:t>
+      </w:r>
+      <w:r>
+        <w:rPr>
+          <w:b/>
+          <w:bCs/>
+          <w:sz w:val="32"/>
+          <w:szCs w:val="32"/>
+        </w:rPr>
         <w:t xml:space="preserve">เสร็จสิ้น</w:t>
       </w:r>
       <w:r>
@@ -1458,7 +2457,7 @@
           <w:sz w:val="32"/>
           <w:szCs w:val="32"/>
         </w:rPr>
-        <w:t xml:space="preserve"> ระบบจะแจ้งผู้จัดการ SOC โดยอัตโนมัติ</w:t>
+        <w:t xml:space="preserve"> และระบบแจ้งผู้จัดการ SOC พร้อมเลขที่รายงานโดยอัตโนมัติ</w:t>
       </w:r>
     </w:p>
     <w:tbl>
@@ -1516,7 +2515,7 @@
                 <w:sz w:val="32"/>
                 <w:szCs w:val="32"/>
               </w:rPr>
-              <w:t xml:space="preserve">แบบฟอร์มอัปเดตคำขอ: สถานะ ผลการดำเนินการ และการแนบไฟล์ผล</w:t>
+              <w:t xml:space="preserve">การ์ดงานของคุณขณะกำลังดำเนินการ: เลขที่รายงานที่ส่ง ผลการดำเนินการ แนบไฟล์ผล และปุ่มส่งงาน · เสร็จสิ้น / บันทึกไว้ก่อน</w:t>
             </w:r>
           </w:p>
           <w:p>
@@ -1530,7 +2529,7 @@
                 <w:sz w:val="24"/>
                 <w:szCs w:val="24"/>
               </w:rPr>
-              <w:t xml:space="preserve">SHOT: RED-update</w:t>
+              <w:t xml:space="preserve">SHOT: RED-my-request-submit</w:t>
             </w:r>
           </w:p>
         </w:tc>
@@ -1549,7 +2548,7 @@
           <w:sz w:val="28"/>
           <w:szCs w:val="28"/>
         </w:rPr>
-        <w:t xml:space="preserve">รูปที่ 5-1  </w:t>
+        <w:t xml:space="preserve">รูปที่ 5-2  </w:t>
       </w:r>
       <w:r>
         <w:rPr>
@@ -1559,8 +2558,108 @@
           <w:sz w:val="28"/>
           <w:szCs w:val="28"/>
         </w:rPr>
-        <w:t xml:space="preserve">แบบฟอร์มอัปเดตคำขอ: สถานะ ผลการดำเนินการ และการแนบไฟล์ผล</w:t>
-      </w:r>
+        <w:t xml:space="preserve">การ์ดงานของคุณขณะกำลังดำเนินการ: เลขที่รายงานที่ส่ง ผลการดำเนินการ แนบไฟล์ผล และปุ่มส่งงาน · เสร็จสิ้น / บันทึกไว้ก่อน</w:t>
+      </w:r>
+    </w:p>
+    <w:tbl>
+      <w:tblPr>
+        <w:tblW w:type="dxa" w:w="9600"/>
+        <w:tblBorders>
+          <w:top w:val="single" w:color="FDECEE" w:sz="2"/>
+          <w:left w:val="single" w:color="E63946" w:sz="28"/>
+          <w:bottom w:val="single" w:color="FDECEE" w:sz="2"/>
+          <w:right w:val="single" w:color="FDECEE" w:sz="2"/>
+          <w:insideH w:val="single" w:color="auto" w:sz="4"/>
+          <w:insideV w:val="single" w:color="auto" w:sz="4"/>
+        </w:tblBorders>
+      </w:tblPr>
+      <w:tblGrid>
+        <w:gridCol w:w="9600"/>
+      </w:tblGrid>
+      <w:tr>
+        <w:tc>
+          <w:tcPr>
+            <w:tcW w:type="dxa" w:w="9600"/>
+            <w:shd w:fill="FDECEE" w:color="auto" w:val="clear"/>
+            <w:tcMar>
+              <w:top w:type="dxa" w:w="140"/>
+              <w:left w:type="dxa" w:w="200"/>
+              <w:bottom w:type="dxa" w:w="140"/>
+              <w:right w:type="dxa" w:w="200"/>
+            </w:tcMar>
+          </w:tcPr>
+          <w:p>
+            <w:pPr>
+              <w:spacing w:after="60"/>
+            </w:pPr>
+            <w:r>
+              <w:rPr>
+                <w:b/>
+                <w:bCs/>
+                <w:color w:val="E63946"/>
+                <w:sz w:val="30"/>
+                <w:szCs w:val="30"/>
+              </w:rPr>
+              <w:t xml:space="preserve">ข้อควรระวัง</w:t>
+            </w:r>
+          </w:p>
+          <w:p>
+            <w:pPr>
+              <w:spacing w:after="60"/>
+            </w:pPr>
+            <w:r>
+              <w:rPr>
+                <w:sz w:val="32"/>
+                <w:szCs w:val="32"/>
+              </w:rPr>
+              <w:t xml:space="preserve">ส่งงานโดยไม่มีเลขที่รายงานไม่ได้ — เบราว์เซอร์จะเตือนที่ช่อง </w:t>
+            </w:r>
+            <w:r>
+              <w:rPr>
+                <w:b/>
+                <w:bCs/>
+                <w:color w:val="1F2D3D"/>
+                <w:sz w:val="32"/>
+                <w:szCs w:val="32"/>
+              </w:rPr>
+              <w:t xml:space="preserve">เลขที่รายงานที่ส่ง</w:t>
+            </w:r>
+            <w:r>
+              <w:rPr>
+                <w:sz w:val="32"/>
+                <w:szCs w:val="32"/>
+              </w:rPr>
+              <w:t xml:space="preserve"> ก่อนส่ง และระบบจะปฏิเสธด้วยข้อความ </w:t>
+            </w:r>
+            <w:r>
+              <w:rPr>
+                <w:b/>
+                <w:bCs/>
+                <w:sz w:val="32"/>
+                <w:szCs w:val="32"/>
+              </w:rPr>
+              <w:t xml:space="preserve">“กรุณาระบุเลขที่รายงานที่ส่งแล้ว ก่อนปิดงานเป็น "เสร็จสิ้น"”</w:t>
+            </w:r>
+          </w:p>
+          <w:p>
+            <w:pPr>
+              <w:spacing w:after="0"/>
+            </w:pPr>
+            <w:r>
+              <w:rPr>
+                <w:sz w:val="32"/>
+                <w:szCs w:val="32"/>
+              </w:rPr>
+              <w:t xml:space="preserve">เมื่อส่งงานแล้วคำขอจะแก้ไขไม่ได้อีก แนบไฟล์และตรวจเลขที่รายงานให้ครบก่อนกดยืนยัน</w:t>
+            </w:r>
+          </w:p>
+        </w:tc>
+      </w:tr>
+    </w:tbl>
+    <w:p>
+      <w:pPr>
+        <w:spacing w:after="80"/>
+      </w:pPr>
     </w:p>
     <w:tbl>
       <w:tblPr>
@@ -1661,7 +2760,7 @@
                 <w:sz w:val="32"/>
                 <w:szCs w:val="32"/>
               </w:rPr>
-              <w:t xml:space="preserve"> แนบไฟล์ผลเพื่อให้ทีม SOC ใช้อ้างอิงประกอบการปิดงาน</w:t>
+              <w:t xml:space="preserve"> ตรงกับตัวติดตามบนการ์ด หลังส่งงาน การ์ดเปลี่ยนเป็น “ส่งงานแล้ว” พร้อมเลขที่รายงาน แนบไฟล์ผลเพื่อให้ทีม SOC ใช้อ้างอิงประกอบการปิดงาน</w:t>
             </w:r>
           </w:p>
         </w:tc>
@@ -1968,7 +3067,7 @@
                 <w:sz w:val="28"/>
                 <w:szCs w:val="28"/>
               </w:rPr>
-              <w:t xml:space="preserve">เริ่มดำเนินการ แล้วเปลี่ยนเป็น “กำลังดำเนินการ”</w:t>
+              <w:t xml:space="preserve">กด “รับงาน” บนการ์ด งานของคุณ (หรือที่แถวในหน้างานตอบสนอง) — สถานะเปลี่ยนเป็น “กำลังดำเนินการ”</w:t>
             </w:r>
           </w:p>
         </w:tc>
@@ -2033,7 +3132,7 @@
                 <w:sz w:val="28"/>
                 <w:szCs w:val="28"/>
               </w:rPr>
-              <w:t xml:space="preserve">คุณกำลังดำเนินการ</w:t>
+              <w:t xml:space="preserve">คุณรับงานแล้วและกำลังดำเนินการ</w:t>
             </w:r>
           </w:p>
         </w:tc>
@@ -2057,7 +3156,7 @@
                 <w:sz w:val="28"/>
                 <w:szCs w:val="28"/>
               </w:rPr>
-              <w:t xml:space="preserve">บันทึกผลระหว่างทาง แล้วปิดท้ายด้วย “เสร็จสิ้น”</w:t>
+              <w:t xml:space="preserve">บันทึกผลระหว่างทางด้วย “บันทึกไว้ก่อน” แล้วกด “ส่งงาน · เสร็จสิ้น” บนการ์ดพร้อมเลขที่รายงาน</w:t>
             </w:r>
           </w:p>
         </w:tc>
@@ -2122,7 +3221,7 @@
                 <w:sz w:val="28"/>
                 <w:szCs w:val="28"/>
               </w:rPr>
-              <w:t xml:space="preserve">ดำเนินการครบแล้ว</w:t>
+              <w:t xml:space="preserve">ส่งงานแล้ว</w:t>
             </w:r>
           </w:p>
         </w:tc>
@@ -2146,7 +3245,7 @@
                 <w:sz w:val="28"/>
                 <w:szCs w:val="28"/>
               </w:rPr>
-              <w:t xml:space="preserve">ไม่มี — ระบบแจ้งผู้จัดการ SOC ให้อัตโนมัติ</w:t>
+              <w:t xml:space="preserve">ไม่มี — การ์ดแสดง “ส่งงานแล้ว” และระบบแจ้งผู้จัดการ SOC ให้อัตโนมัติ</w:t>
             </w:r>
           </w:p>
         </w:tc>
@@ -2309,7 +3408,7 @@
                 <w:sz w:val="28"/>
                 <w:szCs w:val="28"/>
               </w:rPr>
-              <w:t xml:space="preserve">คุณทำเครื่องหมายคำขอเป็น “เสร็จสิ้น”</w:t>
+              <w:t xml:space="preserve">คุณกด “ส่งงาน · เสร็จสิ้น”</w:t>
             </w:r>
           </w:p>
         </w:tc>
@@ -2333,7 +3432,7 @@
                 <w:sz w:val="28"/>
                 <w:szCs w:val="28"/>
               </w:rPr>
-              <w:t xml:space="preserve">ผู้จัดการ SOC ผู้ออกคำขอ</w:t>
+              <w:t xml:space="preserve">ผู้จัดการ SOC ผู้ออกคำขอ (อีเมลระบุเลขที่รายงาน)</w:t>
             </w:r>
           </w:p>
         </w:tc>
@@ -2341,6 +3440,119 @@
     </w:tbl>
     <w:p>
       <w:pPr>
+        <w:spacing w:after="80"/>
+      </w:pPr>
+    </w:p>
+    <w:tbl>
+      <w:tblPr>
+        <w:tblW w:type="dxa" w:w="9600"/>
+        <w:tblBorders>
+          <w:top w:val="single" w:color="F1F3F6" w:sz="2"/>
+          <w:left w:val="single" w:color="6C7888" w:sz="28"/>
+          <w:bottom w:val="single" w:color="F1F3F6" w:sz="2"/>
+          <w:right w:val="single" w:color="F1F3F6" w:sz="2"/>
+          <w:insideH w:val="single" w:color="auto" w:sz="4"/>
+          <w:insideV w:val="single" w:color="auto" w:sz="4"/>
+        </w:tblBorders>
+      </w:tblPr>
+      <w:tblGrid>
+        <w:gridCol w:w="9600"/>
+      </w:tblGrid>
+      <w:tr>
+        <w:tc>
+          <w:tcPr>
+            <w:tcW w:type="dxa" w:w="9600"/>
+            <w:shd w:fill="F1F3F6" w:color="auto" w:val="clear"/>
+            <w:tcMar>
+              <w:top w:type="dxa" w:w="140"/>
+              <w:left w:type="dxa" w:w="200"/>
+              <w:bottom w:type="dxa" w:w="140"/>
+              <w:right w:type="dxa" w:w="200"/>
+            </w:tcMar>
+          </w:tcPr>
+          <w:p>
+            <w:pPr>
+              <w:spacing w:after="60"/>
+            </w:pPr>
+            <w:r>
+              <w:rPr>
+                <w:b/>
+                <w:bCs/>
+                <w:color w:val="6C7888"/>
+                <w:sz w:val="30"/>
+                <w:szCs w:val="30"/>
+              </w:rPr>
+              <w:t xml:space="preserve">สิ่งที่ต้องจำ</w:t>
+            </w:r>
+          </w:p>
+          <w:p>
+            <w:pPr>
+              <w:spacing w:after="0"/>
+            </w:pPr>
+            <w:r>
+              <w:rPr>
+                <w:sz w:val="32"/>
+                <w:szCs w:val="32"/>
+              </w:rPr>
+              <w:t xml:space="preserve">การกด </w:t>
+            </w:r>
+            <w:r>
+              <w:rPr>
+                <w:b/>
+                <w:bCs/>
+                <w:color w:val="1F2D3D"/>
+                <w:sz w:val="32"/>
+                <w:szCs w:val="32"/>
+              </w:rPr>
+              <w:t xml:space="preserve">รับงาน</w:t>
+            </w:r>
+            <w:r>
+              <w:rPr>
+                <w:sz w:val="32"/>
+                <w:szCs w:val="32"/>
+              </w:rPr>
+              <w:t xml:space="preserve"> หรือ </w:t>
+            </w:r>
+            <w:r>
+              <w:rPr>
+                <w:b/>
+                <w:bCs/>
+                <w:color w:val="1F2D3D"/>
+                <w:sz w:val="32"/>
+                <w:szCs w:val="32"/>
+              </w:rPr>
+              <w:t xml:space="preserve">บันทึกไว้ก่อน</w:t>
+            </w:r>
+            <w:r>
+              <w:rPr>
+                <w:sz w:val="32"/>
+                <w:szCs w:val="32"/>
+              </w:rPr>
+              <w:t xml:space="preserve"> ไม่ส่งอีเมล และลิงก์ในอีเมลแจ้งคำขอใหม่พาไปที่การ์ด </w:t>
+            </w:r>
+            <w:r>
+              <w:rPr>
+                <w:b/>
+                <w:bCs/>
+                <w:color w:val="1F2D3D"/>
+                <w:sz w:val="32"/>
+                <w:szCs w:val="32"/>
+              </w:rPr>
+              <w:t xml:space="preserve">งานของคุณ</w:t>
+            </w:r>
+            <w:r>
+              <w:rPr>
+                <w:sz w:val="32"/>
+                <w:szCs w:val="32"/>
+              </w:rPr>
+              <w:t xml:space="preserve"> บนหน้าตั๋วเสมอ</w:t>
+            </w:r>
+          </w:p>
+        </w:tc>
+      </w:tr>
+    </w:tbl>
+    <w:p>
+      <w:pPr>
         <w:pStyle w:val="Heading1"/>
       </w:pPr>
       <w:r>
@@ -2365,6 +3577,66 @@
           <w:szCs w:val="32"/>
         </w:rPr>
         <w:t xml:space="preserve">ระบบแสดงเฉพาะตั๋วที่มีคำขอมอบหมายให้คุณเท่านั้น</w:t>
+      </w:r>
+    </w:p>
+    <w:p>
+      <w:pPr>
+        <w:pStyle w:val="Heading3"/>
+      </w:pPr>
+      <w:r>
+        <w:t xml:space="preserve">หาปุ่ม “อัปเดตงาน” ในรายการคำขอไม่เจอ?</w:t>
+      </w:r>
+    </w:p>
+    <w:p>
+      <w:pPr>
+        <w:spacing w:after="120"/>
+      </w:pPr>
+      <w:r>
+        <w:rPr>
+          <w:sz w:val="32"/>
+          <w:szCs w:val="32"/>
+        </w:rPr>
+        <w:t xml:space="preserve">คำขอของคุณไม่ได้อัปเดตจากรายการแล้ว แถวของคุณมีปุ่ม “ไปที่งานของคุณ” ซึ่งพาขึ้นไปที่การ์ด “งานของคุณ” ด้านบนของคอลัมน์การดำเนินการ — รับงานและส่งงานที่การ์ดนั้น</w:t>
+      </w:r>
+    </w:p>
+    <w:p>
+      <w:pPr>
+        <w:pStyle w:val="Heading3"/>
+      </w:pPr>
+      <w:r>
+        <w:t xml:space="preserve">ทำไมกด “ส่งงาน · เสร็จสิ้น” ไม่ได้?</w:t>
+      </w:r>
+    </w:p>
+    <w:p>
+      <w:pPr>
+        <w:spacing w:after="120"/>
+      </w:pPr>
+      <w:r>
+        <w:rPr>
+          <w:sz w:val="32"/>
+          <w:szCs w:val="32"/>
+        </w:rPr>
+        <w:t xml:space="preserve">ช่องเลขที่รายงานที่ส่งว่างอยู่ — ต้องระบุเลขของรายงานที่ส่งแล้วก่อน ส่วนผลการดำเนินการและไฟล์จะเว้นว่างก็ได้ หากยังไม่พร้อมให้กด “บันทึกไว้ก่อน (ยังไม่ส่งงาน)”</w:t>
+      </w:r>
+    </w:p>
+    <w:p>
+      <w:pPr>
+        <w:pStyle w:val="Heading3"/>
+      </w:pPr>
+      <w:r>
+        <w:t xml:space="preserve">ไม่เห็นปุ่ม “รับงาน”?</w:t>
+      </w:r>
+    </w:p>
+    <w:p>
+      <w:pPr>
+        <w:spacing w:after="120"/>
+      </w:pPr>
+      <w:r>
+        <w:rPr>
+          <w:sz w:val="32"/>
+          <w:szCs w:val="32"/>
+        </w:rPr>
+        <w:t xml:space="preserve">ปุ่มนี้แสดงเฉพาะผู้รับผิดชอบคำขอ และเฉพาะคำขอที่ยังอยู่ในสถานะ “เปิด” — ถ้าคำขอเป็น “กำลังดำเนินการ” แล้ว แปลว่ารับงานไปแล้ว การ์ดจะแสดงแบบฟอร์มส่งงานแทน</w:t>
       </w:r>
     </w:p>
     <w:p>
@@ -2646,6 +3918,226 @@
                 <w:szCs w:val="28"/>
               </w:rPr>
               <w:t xml:space="preserve">เหตุการณ์ที่คำขอของคุณผูกอยู่</w:t>
+            </w:r>
+          </w:p>
+        </w:tc>
+      </w:tr>
+      <w:tr>
+        <w:trPr>
+          <w:cantSplit/>
+        </w:trPr>
+        <w:tc>
+          <w:tcPr>
+            <w:tcW w:type="dxa" w:w="3600"/>
+            <w:shd w:fill="F7F8FA" w:color="auto" w:val="clear"/>
+            <w:tcMar>
+              <w:top w:type="dxa" w:w="70"/>
+              <w:left w:type="dxa" w:w="120"/>
+              <w:bottom w:type="dxa" w:w="70"/>
+              <w:right w:type="dxa" w:w="120"/>
+            </w:tcMar>
+          </w:tcPr>
+          <w:p>
+            <w:pPr>
+              <w:spacing w:after="0"/>
+            </w:pPr>
+            <w:r>
+              <w:rPr>
+                <w:b/>
+                <w:bCs/>
+                <w:sz w:val="32"/>
+                <w:szCs w:val="32"/>
+              </w:rPr>
+              <w:t xml:space="preserve">งานของคุณ</w:t>
+            </w:r>
+          </w:p>
+        </w:tc>
+        <w:tc>
+          <w:tcPr>
+            <w:tcW w:type="dxa" w:w="6000"/>
+            <w:shd w:fill="F7F8FA" w:color="auto" w:val="clear"/>
+            <w:tcMar>
+              <w:top w:type="dxa" w:w="70"/>
+              <w:left w:type="dxa" w:w="120"/>
+              <w:bottom w:type="dxa" w:w="70"/>
+              <w:right w:type="dxa" w:w="120"/>
+            </w:tcMar>
+          </w:tcPr>
+          <w:p>
+            <w:pPr>
+              <w:spacing w:after="0"/>
+            </w:pPr>
+            <w:r>
+              <w:rPr>
+                <w:sz w:val="28"/>
+                <w:szCs w:val="28"/>
+              </w:rPr>
+              <w:t xml:space="preserve">การ์ดด้านบนคอลัมน์การดำเนินการของหน้าตั๋ว แสดงคำขอที่มอบหมายให้คุณ พร้อมตัวติดตาม รับงาน → ดำเนินการ → ส่งงาน</w:t>
+            </w:r>
+          </w:p>
+        </w:tc>
+      </w:tr>
+      <w:tr>
+        <w:trPr>
+          <w:cantSplit/>
+        </w:trPr>
+        <w:tc>
+          <w:tcPr>
+            <w:tcW w:type="dxa" w:w="3600"/>
+            <w:shd w:fill="FFFFFF" w:color="auto" w:val="clear"/>
+            <w:tcMar>
+              <w:top w:type="dxa" w:w="70"/>
+              <w:left w:type="dxa" w:w="120"/>
+              <w:bottom w:type="dxa" w:w="70"/>
+              <w:right w:type="dxa" w:w="120"/>
+            </w:tcMar>
+          </w:tcPr>
+          <w:p>
+            <w:pPr>
+              <w:spacing w:after="0"/>
+            </w:pPr>
+            <w:r>
+              <w:rPr>
+                <w:b/>
+                <w:bCs/>
+                <w:sz w:val="32"/>
+                <w:szCs w:val="32"/>
+              </w:rPr>
+              <w:t xml:space="preserve">รับงาน</w:t>
+            </w:r>
+          </w:p>
+        </w:tc>
+        <w:tc>
+          <w:tcPr>
+            <w:tcW w:type="dxa" w:w="6000"/>
+            <w:shd w:fill="FFFFFF" w:color="auto" w:val="clear"/>
+            <w:tcMar>
+              <w:top w:type="dxa" w:w="70"/>
+              <w:left w:type="dxa" w:w="120"/>
+              <w:bottom w:type="dxa" w:w="70"/>
+              <w:right w:type="dxa" w:w="120"/>
+            </w:tcMar>
+          </w:tcPr>
+          <w:p>
+            <w:pPr>
+              <w:spacing w:after="0"/>
+            </w:pPr>
+            <w:r>
+              <w:rPr>
+                <w:sz w:val="28"/>
+                <w:szCs w:val="28"/>
+              </w:rPr>
+              <w:t xml:space="preserve">ปุ่มที่ผู้รับผิดชอบกดเพื่อยืนยันว่าเริ่มลงมือ เปลี่ยนสถานะคำขอจาก เปิด เป็น กำลังดำเนินการ</w:t>
+            </w:r>
+          </w:p>
+        </w:tc>
+      </w:tr>
+      <w:tr>
+        <w:trPr>
+          <w:cantSplit/>
+        </w:trPr>
+        <w:tc>
+          <w:tcPr>
+            <w:tcW w:type="dxa" w:w="3600"/>
+            <w:shd w:fill="F7F8FA" w:color="auto" w:val="clear"/>
+            <w:tcMar>
+              <w:top w:type="dxa" w:w="70"/>
+              <w:left w:type="dxa" w:w="120"/>
+              <w:bottom w:type="dxa" w:w="70"/>
+              <w:right w:type="dxa" w:w="120"/>
+            </w:tcMar>
+          </w:tcPr>
+          <w:p>
+            <w:pPr>
+              <w:spacing w:after="0"/>
+            </w:pPr>
+            <w:r>
+              <w:rPr>
+                <w:b/>
+                <w:bCs/>
+                <w:sz w:val="32"/>
+                <w:szCs w:val="32"/>
+              </w:rPr>
+              <w:t xml:space="preserve">ส่งงาน · เสร็จสิ้น</w:t>
+            </w:r>
+          </w:p>
+        </w:tc>
+        <w:tc>
+          <w:tcPr>
+            <w:tcW w:type="dxa" w:w="6000"/>
+            <w:shd w:fill="F7F8FA" w:color="auto" w:val="clear"/>
+            <w:tcMar>
+              <w:top w:type="dxa" w:w="70"/>
+              <w:left w:type="dxa" w:w="120"/>
+              <w:bottom w:type="dxa" w:w="70"/>
+              <w:right w:type="dxa" w:w="120"/>
+            </w:tcMar>
+          </w:tcPr>
+          <w:p>
+            <w:pPr>
+              <w:spacing w:after="0"/>
+            </w:pPr>
+            <w:r>
+              <w:rPr>
+                <w:sz w:val="28"/>
+                <w:szCs w:val="28"/>
+              </w:rPr>
+              <w:t xml:space="preserve">ปุ่มบนการ์ดที่ปิดคำขอเป็น เสร็จสิ้น (มีกล่องยืนยัน) ต่างจาก บันทึกไว้ก่อน ที่เก็บข้อมูลไว้โดยยังไม่ส่งงาน</w:t>
+            </w:r>
+          </w:p>
+        </w:tc>
+      </w:tr>
+      <w:tr>
+        <w:trPr>
+          <w:cantSplit/>
+        </w:trPr>
+        <w:tc>
+          <w:tcPr>
+            <w:tcW w:type="dxa" w:w="3600"/>
+            <w:shd w:fill="FFFFFF" w:color="auto" w:val="clear"/>
+            <w:tcMar>
+              <w:top w:type="dxa" w:w="70"/>
+              <w:left w:type="dxa" w:w="120"/>
+              <w:bottom w:type="dxa" w:w="70"/>
+              <w:right w:type="dxa" w:w="120"/>
+            </w:tcMar>
+          </w:tcPr>
+          <w:p>
+            <w:pPr>
+              <w:spacing w:after="0"/>
+            </w:pPr>
+            <w:r>
+              <w:rPr>
+                <w:b/>
+                <w:bCs/>
+                <w:sz w:val="32"/>
+                <w:szCs w:val="32"/>
+              </w:rPr>
+              <w:t xml:space="preserve">เลขที่รายงาน</w:t>
+            </w:r>
+          </w:p>
+        </w:tc>
+        <w:tc>
+          <w:tcPr>
+            <w:tcW w:type="dxa" w:w="6000"/>
+            <w:shd w:fill="FFFFFF" w:color="auto" w:val="clear"/>
+            <w:tcMar>
+              <w:top w:type="dxa" w:w="70"/>
+              <w:left w:type="dxa" w:w="120"/>
+              <w:bottom w:type="dxa" w:w="70"/>
+              <w:right w:type="dxa" w:w="120"/>
+            </w:tcMar>
+          </w:tcPr>
+          <w:p>
+            <w:pPr>
+              <w:spacing w:after="0"/>
+            </w:pPr>
+            <w:r>
+              <w:rPr>
+                <w:sz w:val="28"/>
+                <w:szCs w:val="28"/>
+              </w:rPr>
+              <w:t xml:space="preserve">เลขของรายงานที่ส่ง (SOC-VAPT-YYYYMM-NNNN หรือ SOC-HARD-YYYYMM-NNNN ตามประเภทคำขอ) บังคับกรอกก่อนส่งงาน</w:t>
             </w:r>
           </w:p>
         </w:tc>
@@ -2944,6 +4436,24 @@
       </w:rPr>
     </w:lvl>
   </w:abstractNum>
+  <w:abstractNum w:abstractNumId="5" w15:restartNumberingAfterBreak="0">
+    <w:multiLevelType w:val="hybridMultilevel"/>
+    <w:lvl w:ilvl="0" w15:tentative="1">
+      <w:start w:val="1"/>
+      <w:numFmt w:val="decimal"/>
+      <w:lvlText w:val="%1."/>
+      <w:lvlJc w:val="start"/>
+      <w:pPr>
+        <w:ind w:left="460" w:hanging="300"/>
+      </w:pPr>
+      <w:rPr>
+        <w:rFonts w:ascii="TH Sarabun New" w:cs="TH Sarabun New" w:eastAsia="TH Sarabun New" w:hAnsi="TH Sarabun New"/>
+        <w:b/>
+        <w:bCs/>
+        <w:color w:val="245EA8"/>
+      </w:rPr>
+    </w:lvl>
+  </w:abstractNum>
   <w:num w:numId="1">
     <w:abstractNumId w:val="1"/>
     <w:lvlOverride w:ilvl="0">
@@ -2957,7 +4467,19 @@
     </w:lvlOverride>
   </w:num>
   <w:num w:numId="3">
+    <w:abstractNumId w:val="2"/>
+    <w:lvlOverride w:ilvl="0">
+      <w:startOverride w:val="1"/>
+    </w:lvlOverride>
+  </w:num>
+  <w:num w:numId="4">
     <w:abstractNumId w:val="4"/>
+    <w:lvlOverride w:ilvl="0">
+      <w:startOverride w:val="1"/>
+    </w:lvlOverride>
+  </w:num>
+  <w:num w:numId="5">
+    <w:abstractNumId w:val="5"/>
     <w:lvlOverride w:ilvl="0">
       <w:startOverride w:val="1"/>
     </w:lvlOverride>

</xml_diff>

<commit_message>
25/9 Password Notification + Inconsistencies fix + Red Team Function
</commit_message>
<xml_diff>
--- a/docs/user-guides/manuals/user-manual-redteam-manager.th.docx
+++ b/docs/user-guides/manuals/user-manual-redteam-manager.th.docx
@@ -197,7 +197,7 @@
           <w:sz w:val="28"/>
           <w:szCs w:val="28"/>
         </w:rPr>
-        <w:t xml:space="preserve">ปรับปรุงล่าสุด 24 กันยายน 2026</w:t>
+        <w:t xml:space="preserve">ปรับปรุงล่าสุด 25 กันยายน 2026</w:t>
       </w:r>
     </w:p>
     <w:p>
@@ -349,7 +349,7 @@
           <w:sz w:val="32"/>
           <w:szCs w:val="32"/>
         </w:rPr>
-        <w:t xml:space="preserve">งานของคุณเน้นการตรวจสอบช่องโหว่ การทดสอบเจาะระบบ และความมั่นคงปลอดภัยของโครงสร้างพื้นฐาน</w:t>
+        <w:t xml:space="preserve">ผู้ดูแลระบบกำหนดบัญชีผู้จัดการ Red Team แยกสำหรับ VA, PenTest และ Hardening แต่ละคนได้รับเฉพาะคำขอของประเภทที่รับผิดชอบ</w:t>
       </w:r>
     </w:p>
     <w:p>
@@ -601,7 +601,7 @@
                 <w:sz w:val="28"/>
                 <w:szCs w:val="28"/>
               </w:rPr>
-              <w:t xml:space="preserve">VA / Pentest</w:t>
+              <w:t xml:space="preserve">VA</w:t>
             </w:r>
           </w:p>
         </w:tc>
@@ -625,7 +625,7 @@
                 <w:sz w:val="28"/>
                 <w:szCs w:val="28"/>
               </w:rPr>
-              <w:t xml:space="preserve">ตรวจสอบช่องโหว่และทดสอบเจาะระบบ</w:t>
+              <w:t xml:space="preserve">ตรวจสอบช่องโหว่</w:t>
             </w:r>
           </w:p>
         </w:tc>
@@ -654,7 +654,7 @@
                 <w:sz w:val="28"/>
                 <w:szCs w:val="28"/>
               </w:rPr>
-              <w:t xml:space="preserve">Infrastructure Security</w:t>
+              <w:t xml:space="preserve">PenTest</w:t>
             </w:r>
           </w:p>
         </w:tc>
@@ -662,6 +662,59 @@
           <w:tcPr>
             <w:tcW w:type="dxa" w:w="5400"/>
             <w:shd w:fill="F7F8FA" w:color="auto" w:val="clear"/>
+            <w:tcMar>
+              <w:top w:type="dxa" w:w="70"/>
+              <w:left w:type="dxa" w:w="120"/>
+              <w:bottom w:type="dxa" w:w="70"/>
+              <w:right w:type="dxa" w:w="120"/>
+            </w:tcMar>
+          </w:tcPr>
+          <w:p>
+            <w:pPr>
+              <w:spacing w:after="0"/>
+            </w:pPr>
+            <w:r>
+              <w:rPr>
+                <w:sz w:val="28"/>
+                <w:szCs w:val="28"/>
+              </w:rPr>
+              <w:t xml:space="preserve">ทดสอบเจาะระบบ</w:t>
+            </w:r>
+          </w:p>
+        </w:tc>
+      </w:tr>
+      <w:tr>
+        <w:trPr>
+          <w:cantSplit/>
+        </w:trPr>
+        <w:tc>
+          <w:tcPr>
+            <w:tcW w:type="dxa" w:w="4200"/>
+            <w:shd w:fill="FFFFFF" w:color="auto" w:val="clear"/>
+            <w:tcMar>
+              <w:top w:type="dxa" w:w="70"/>
+              <w:left w:type="dxa" w:w="120"/>
+              <w:bottom w:type="dxa" w:w="70"/>
+              <w:right w:type="dxa" w:w="120"/>
+            </w:tcMar>
+          </w:tcPr>
+          <w:p>
+            <w:pPr>
+              <w:spacing w:after="0"/>
+            </w:pPr>
+            <w:r>
+              <w:rPr>
+                <w:sz w:val="28"/>
+                <w:szCs w:val="28"/>
+              </w:rPr>
+              <w:t xml:space="preserve">Hardening</w:t>
+            </w:r>
+          </w:p>
+        </w:tc>
+        <w:tc>
+          <w:tcPr>
+            <w:tcW w:type="dxa" w:w="5400"/>
+            <w:shd w:fill="FFFFFF" w:color="auto" w:val="clear"/>
             <w:tcMar>
               <w:top w:type="dxa" w:w="70"/>
               <w:left w:type="dxa" w:w="120"/>
@@ -2276,7 +2329,7 @@
           <w:sz w:val="32"/>
           <w:szCs w:val="32"/>
         </w:rPr>
-        <w:t xml:space="preserve"> (บังคับ) — ระบบเติมเลขของเคสนี้ให้ในรูปแบบ </w:t>
+        <w:t xml:space="preserve"> (บังคับ) แล้วกรอกเลขบนรายงานที่ส่งจริง ระบบแสดง </w:t>
       </w:r>
       <w:r>
         <w:rPr>
@@ -2284,14 +2337,14 @@
           <w:sz w:val="32"/>
           <w:szCs w:val="32"/>
         </w:rPr>
-        <w:t xml:space="preserve">SOC-VAPT-YYYYMM-NNNN</w:t>
-      </w:r>
-      <w:r>
-        <w:rPr>
-          <w:sz w:val="32"/>
-          <w:szCs w:val="32"/>
-        </w:rPr>
-        <w:t xml:space="preserve"> (VA / Pentest) หรือ </w:t>
+        <w:t xml:space="preserve">VA-YYYY-NNNN</w:t>
+      </w:r>
+      <w:r>
+        <w:rPr>
+          <w:sz w:val="32"/>
+          <w:szCs w:val="32"/>
+        </w:rPr>
+        <w:t xml:space="preserve"> / </w:t>
       </w:r>
       <w:r>
         <w:rPr>
@@ -2299,14 +2352,29 @@
           <w:sz w:val="32"/>
           <w:szCs w:val="32"/>
         </w:rPr>
-        <w:t xml:space="preserve">SOC-HARD-YYYYMM-NNNN</w:t>
-      </w:r>
-      <w:r>
-        <w:rPr>
-          <w:sz w:val="32"/>
-          <w:szCs w:val="32"/>
-        </w:rPr>
-        <w:t xml:space="preserve"> (Infrastructure Security) แก้ได้ให้ตรงกับเลขบนรายงานที่ส่งจริง</w:t>
+        <w:t xml:space="preserve">PT-YYYY-NNNN</w:t>
+      </w:r>
+      <w:r>
+        <w:rPr>
+          <w:sz w:val="32"/>
+          <w:szCs w:val="32"/>
+        </w:rPr>
+        <w:t xml:space="preserve"> / </w:t>
+      </w:r>
+      <w:r>
+        <w:rPr>
+          <w:rFonts w:ascii="Consolas" w:cs="Consolas" w:eastAsia="Consolas" w:hAnsi="Consolas"/>
+          <w:sz w:val="32"/>
+          <w:szCs w:val="32"/>
+        </w:rPr>
+        <w:t xml:space="preserve">BL-YYYY-NNNN</w:t>
+      </w:r>
+      <w:r>
+        <w:rPr>
+          <w:sz w:val="32"/>
+          <w:szCs w:val="32"/>
+        </w:rPr>
+        <w:t xml:space="preserve"> เป็นแนวทางเท่านั้น แต่ละประเภทมีลำดับเลขแยกกัน และระบบไม่เลือกเลขให้</w:t>
       </w:r>
     </w:p>
     <w:p>
@@ -2333,31 +2401,14 @@
           <w:sz w:val="32"/>
           <w:szCs w:val="32"/>
         </w:rPr>
-        <w:t xml:space="preserve">ผลการดำเนินการ (ถ้ามี)</w:t>
-      </w:r>
-      <w:r>
-        <w:rPr>
-          <w:sz w:val="32"/>
-          <w:szCs w:val="32"/>
-        </w:rPr>
-        <w:t xml:space="preserve"> และ </w:t>
-      </w:r>
-      <w:r>
-        <w:rPr>
-          <w:b/>
-          <w:bCs/>
-          <w:color w:val="1F2D3D"/>
-          <w:sz w:val="32"/>
-          <w:szCs w:val="32"/>
-        </w:rPr>
-        <w:t xml:space="preserve">แนบไฟล์ผล (ถ้ามี)</w:t>
-      </w:r>
-      <w:r>
-        <w:rPr>
-          <w:sz w:val="32"/>
-          <w:szCs w:val="32"/>
-        </w:rPr>
-        <w:t xml:space="preserve"> พร้อมคำอธิบายไฟล์ในช่องใต้ปุ่มเลือกไฟล์</w:t>
+        <w:t xml:space="preserve">หมายเหตุ (ถ้ามี)</w:t>
+      </w:r>
+      <w:r>
+        <w:rPr>
+          <w:sz w:val="32"/>
+          <w:szCs w:val="32"/>
+        </w:rPr>
+        <w:t xml:space="preserve"> หรือเว้นว่างได้ ไม่มีช่องแนบไฟล์ผล</w:t>
       </w:r>
     </w:p>
     <w:p>
@@ -2391,7 +2442,7 @@
           <w:sz w:val="32"/>
           <w:szCs w:val="32"/>
         </w:rPr>
-        <w:t xml:space="preserve"> เพื่อเก็บผลและไฟล์ไว้ คำขอยังอยู่ที่ </w:t>
+        <w:t xml:space="preserve"> เพื่อเก็บเลขที่รายงานและหมายเหตุไว้ คำขอยังอยู่ที่ </w:t>
       </w:r>
       <w:r>
         <w:rPr>
@@ -2458,107 +2509,6 @@
           <w:szCs w:val="32"/>
         </w:rPr>
         <w:t xml:space="preserve"> และระบบแจ้งผู้จัดการ SOC พร้อมเลขที่รายงานโดยอัตโนมัติ</w:t>
-      </w:r>
-    </w:p>
-    <w:tbl>
-      <w:tblPr>
-        <w:tblW w:type="dxa" w:w="9600"/>
-        <w:tblBorders>
-          <w:top w:val="dashed" w:color="9DB4D4" w:sz="6"/>
-          <w:left w:val="dashed" w:color="9DB4D4" w:sz="6"/>
-          <w:bottom w:val="dashed" w:color="9DB4D4" w:sz="6"/>
-          <w:right w:val="dashed" w:color="9DB4D4" w:sz="6"/>
-          <w:insideH w:val="single" w:color="auto" w:sz="4"/>
-          <w:insideV w:val="single" w:color="auto" w:sz="4"/>
-        </w:tblBorders>
-      </w:tblPr>
-      <w:tblGrid>
-        <w:gridCol w:w="9600"/>
-      </w:tblGrid>
-      <w:tr>
-        <w:tc>
-          <w:tcPr>
-            <w:tcW w:type="dxa" w:w="9600"/>
-            <w:shd w:fill="F7F8FA" w:color="auto" w:val="clear"/>
-            <w:tcMar>
-              <w:top w:type="dxa" w:w="520"/>
-              <w:left w:type="dxa" w:w="200"/>
-              <w:bottom w:type="dxa" w:w="520"/>
-              <w:right w:type="dxa" w:w="200"/>
-            </w:tcMar>
-            <w:vAlign w:val="center"/>
-          </w:tcPr>
-          <w:p>
-            <w:pPr>
-              <w:spacing w:after="40"/>
-              <w:jc w:val="center"/>
-            </w:pPr>
-            <w:r>
-              <w:rPr>
-                <w:b/>
-                <w:bCs/>
-                <w:color w:val="6C7888"/>
-                <w:sz w:val="30"/>
-                <w:szCs w:val="30"/>
-              </w:rPr>
-              <w:t xml:space="preserve">[ ตำแหน่งภาพหน้าจอ ]</w:t>
-            </w:r>
-          </w:p>
-          <w:p>
-            <w:pPr>
-              <w:spacing w:after="40"/>
-              <w:jc w:val="center"/>
-            </w:pPr>
-            <w:r>
-              <w:rPr>
-                <w:color w:val="1F2D3D"/>
-                <w:sz w:val="32"/>
-                <w:szCs w:val="32"/>
-              </w:rPr>
-              <w:t xml:space="preserve">การ์ดงานของคุณขณะกำลังดำเนินการ: เลขที่รายงานที่ส่ง ผลการดำเนินการ แนบไฟล์ผล และปุ่มส่งงาน · เสร็จสิ้น / บันทึกไว้ก่อน</w:t>
-            </w:r>
-          </w:p>
-          <w:p>
-            <w:pPr>
-              <w:jc w:val="center"/>
-            </w:pPr>
-            <w:r>
-              <w:rPr>
-                <w:rFonts w:ascii="Consolas" w:cs="Consolas" w:eastAsia="Consolas" w:hAnsi="Consolas"/>
-                <w:color w:val="9AA6B4"/>
-                <w:sz w:val="24"/>
-                <w:szCs w:val="24"/>
-              </w:rPr>
-              <w:t xml:space="preserve">SHOT: RED-my-request-submit</w:t>
-            </w:r>
-          </w:p>
-        </w:tc>
-      </w:tr>
-    </w:tbl>
-    <w:p>
-      <w:pPr>
-        <w:spacing w:after="160" w:before="60"/>
-        <w:jc w:val="center"/>
-      </w:pPr>
-      <w:r>
-        <w:rPr>
-          <w:b/>
-          <w:bCs/>
-          <w:color w:val="245EA8"/>
-          <w:sz w:val="28"/>
-          <w:szCs w:val="28"/>
-        </w:rPr>
-        <w:t xml:space="preserve">รูปที่ 5-2  </w:t>
-      </w:r>
-      <w:r>
-        <w:rPr>
-          <w:i/>
-          <w:iCs/>
-          <w:color w:val="6C7888"/>
-          <w:sz w:val="28"/>
-          <w:szCs w:val="28"/>
-        </w:rPr>
-        <w:t xml:space="preserve">การ์ดงานของคุณขณะกำลังดำเนินการ: เลขที่รายงานที่ส่ง ผลการดำเนินการ แนบไฟล์ผล และปุ่มส่งงาน · เสร็จสิ้น / บันทึกไว้ก่อน</w:t>
       </w:r>
     </w:p>
     <w:tbl>
@@ -2650,7 +2600,7 @@
                 <w:sz w:val="32"/>
                 <w:szCs w:val="32"/>
               </w:rPr>
-              <w:t xml:space="preserve">เมื่อส่งงานแล้วคำขอจะแก้ไขไม่ได้อีก แนบไฟล์และตรวจเลขที่รายงานให้ครบก่อนกดยืนยัน</w:t>
+              <w:t xml:space="preserve">เมื่อส่งงานแล้วคำขอจะแก้ไขไม่ได้อีก ตรวจเลขที่รายงานให้ถูกต้องก่อนกดยืนยัน</w:t>
             </w:r>
           </w:p>
         </w:tc>
@@ -2760,7 +2710,7 @@
                 <w:sz w:val="32"/>
                 <w:szCs w:val="32"/>
               </w:rPr>
-              <w:t xml:space="preserve"> ตรงกับตัวติดตามบนการ์ด หลังส่งงาน การ์ดเปลี่ยนเป็น “ส่งงานแล้ว” พร้อมเลขที่รายงาน แนบไฟล์ผลเพื่อให้ทีม SOC ใช้อ้างอิงประกอบการปิดงาน</w:t>
+              <w:t xml:space="preserve"> ตรงกับตัวติดตามบนการ์ด หลังส่งงาน การ์ดเปลี่ยนเป็น “ส่งงานแล้ว” พร้อมเลขที่รายงาน</w:t>
             </w:r>
           </w:p>
         </w:tc>
@@ -3616,7 +3566,7 @@
           <w:sz w:val="32"/>
           <w:szCs w:val="32"/>
         </w:rPr>
-        <w:t xml:space="preserve">ช่องเลขที่รายงานที่ส่งว่างอยู่ — ต้องระบุเลขของรายงานที่ส่งแล้วก่อน ส่วนผลการดำเนินการและไฟล์จะเว้นว่างก็ได้ หากยังไม่พร้อมให้กด “บันทึกไว้ก่อน (ยังไม่ส่งงาน)”</w:t>
+        <w:t xml:space="preserve">ช่องเลขที่รายงานที่ส่งว่างอยู่ — ต้องระบุเลขของรายงานที่ส่งแล้วก่อน ส่วนหมายเหตุจะเว้นว่างก็ได้ หากยังไม่พร้อมให้กด “บันทึกไว้ก่อน (ยังไม่ส่งงาน)”</w:t>
       </w:r>
     </w:p>
     <w:p>
@@ -4137,7 +4087,7 @@
                 <w:sz w:val="28"/>
                 <w:szCs w:val="28"/>
               </w:rPr>
-              <w:t xml:space="preserve">เลขของรายงานที่ส่ง (SOC-VAPT-YYYYMM-NNNN หรือ SOC-HARD-YYYYMM-NNNN ตามประเภทคำขอ) บังคับกรอกก่อนส่งงาน</w:t>
+              <w:t xml:space="preserve">เลขของรายงานที่ส่ง ผู้รับผิดชอบกรอกเอง โดยมี VA-YYYY-NNNN, PT-YYYY-NNNN และ BL-YYYY-NNNN เป็นแนวทาง บังคับกรอกก่อนส่งงาน</w:t>
             </w:r>
           </w:p>
         </w:tc>

</xml_diff>